<commit_message>
V01 profile requests&responses completed
</commit_message>
<xml_diff>
--- a/00_Project_Management/assignments/Milestone_4_Interfaces_and_Data_Structures/ATeam/M4_ATeamAssignment_CorbinProbasco_Prt1.docx
+++ b/00_Project_Management/assignments/Milestone_4_Interfaces_and_Data_Structures/ATeam/M4_ATeamAssignment_CorbinProbasco_Prt1.docx
@@ -62,7 +62,7 @@
           <w:color w:val="4EA72E" w:themeColor="accent6"/>
           <w:lang w:eastAsia="en-US"/>
         </w:rPr>
-        <w:t>2</w:t>
+        <w:t>3</w:t>
       </w:r>
       <w:r>
         <w:rPr>
@@ -300,7 +300,18 @@
     </w:p>
     <w:p>
       <w:pPr>
+        <w:rPr>
+          <w:b/>
+          <w:bCs/>
+          <w:sz w:val="8"/>
+          <w:szCs w:val="8"/>
+        </w:rPr>
+      </w:pPr>
+    </w:p>
+    <w:p>
+      <w:pPr>
         <w:pStyle w:val="GitHubProcesses"/>
+        <w:spacing w:before="0"/>
         <w:rPr>
           <w:lang w:eastAsia="en-US"/>
         </w:rPr>
@@ -414,7 +425,7 @@
           <w:color w:val="0070C0"/>
           <w:lang w:eastAsia="en-US"/>
         </w:rPr>
-        <w:t>2</w:t>
+        <w:t>3</w:t>
       </w:r>
       <w:r>
         <w:rPr>
@@ -749,6 +760,217 @@
           <w:lang w:eastAsia="en-US"/>
         </w:rPr>
         <w:t>(</w:t>
+      </w:r>
+      <w:proofErr w:type="gramEnd"/>
+      <w:r>
+        <w:rPr>
+          <w:rFonts w:eastAsia="Times New Roman" w:cs="Times New Roman"/>
+          <w:lang w:eastAsia="en-US"/>
+        </w:rPr>
+        <w:t>)</w:t>
+      </w:r>
+    </w:p>
+    <w:p>
+      <w:pPr>
+        <w:spacing w:line="240" w:lineRule="auto"/>
+        <w:rPr>
+          <w:rFonts w:eastAsia="Times New Roman" w:cs="Times New Roman"/>
+          <w:lang w:eastAsia="en-US"/>
+        </w:rPr>
+      </w:pPr>
+    </w:p>
+    <w:p>
+      <w:pPr>
+        <w:spacing w:line="240" w:lineRule="auto"/>
+        <w:outlineLvl w:val="2"/>
+        <w:rPr>
+          <w:rFonts w:eastAsia="Times New Roman" w:cs="Times New Roman"/>
+          <w:b/>
+          <w:bCs/>
+          <w:sz w:val="27"/>
+          <w:szCs w:val="27"/>
+          <w:lang w:eastAsia="en-US"/>
+        </w:rPr>
+      </w:pPr>
+      <w:r>
+        <w:rPr>
+          <w:rFonts w:eastAsia="Times New Roman" w:cs="Times New Roman"/>
+          <w:b/>
+          <w:bCs/>
+          <w:sz w:val="27"/>
+          <w:szCs w:val="27"/>
+          <w:lang w:eastAsia="en-US"/>
+        </w:rPr>
+        <w:lastRenderedPageBreak/>
+        <w:t>API Client Wrapper</w:t>
+      </w:r>
+    </w:p>
+    <w:p>
+      <w:pPr>
+        <w:numPr>
+          <w:ilvl w:val="0"/>
+          <w:numId w:val="3"/>
+        </w:numPr>
+        <w:spacing w:line="240" w:lineRule="auto"/>
+        <w:rPr>
+          <w:rFonts w:eastAsia="Times New Roman" w:cs="Times New Roman"/>
+          <w:lang w:eastAsia="en-US"/>
+        </w:rPr>
+      </w:pPr>
+      <w:r>
+        <w:rPr>
+          <w:rFonts w:eastAsia="Times New Roman" w:cs="Times New Roman"/>
+          <w:b/>
+          <w:bCs/>
+          <w:lang w:eastAsia="en-US"/>
+        </w:rPr>
+        <w:t>API Configuration Class Diagram</w:t>
+      </w:r>
+      <w:r>
+        <w:rPr>
+          <w:rFonts w:eastAsia="Times New Roman" w:cs="Times New Roman"/>
+          <w:lang w:eastAsia="en-US"/>
+        </w:rPr>
+        <w:t xml:space="preserve"> </w:t>
+      </w:r>
+    </w:p>
+    <w:p>
+      <w:pPr>
+        <w:numPr>
+          <w:ilvl w:val="1"/>
+          <w:numId w:val="2"/>
+        </w:numPr>
+        <w:spacing w:line="240" w:lineRule="auto"/>
+        <w:rPr>
+          <w:rFonts w:eastAsia="Times New Roman" w:cs="Times New Roman"/>
+          <w:lang w:eastAsia="en-US"/>
+        </w:rPr>
+      </w:pPr>
+      <w:proofErr w:type="spellStart"/>
+      <w:r>
+        <w:rPr>
+          <w:rFonts w:eastAsia="Times New Roman" w:cs="Times New Roman"/>
+          <w:lang w:eastAsia="en-US"/>
+        </w:rPr>
+        <w:t>NetworkConfig</w:t>
+      </w:r>
+      <w:proofErr w:type="spellEnd"/>
+      <w:r>
+        <w:rPr>
+          <w:rFonts w:eastAsia="Times New Roman" w:cs="Times New Roman"/>
+          <w:lang w:eastAsia="en-US"/>
+        </w:rPr>
+        <w:t xml:space="preserve"> </w:t>
+      </w:r>
+    </w:p>
+    <w:p>
+      <w:pPr>
+        <w:numPr>
+          <w:ilvl w:val="1"/>
+          <w:numId w:val="2"/>
+        </w:numPr>
+        <w:spacing w:line="240" w:lineRule="auto"/>
+        <w:rPr>
+          <w:rFonts w:eastAsia="Times New Roman" w:cs="Times New Roman"/>
+          <w:lang w:eastAsia="en-US"/>
+        </w:rPr>
+      </w:pPr>
+      <w:proofErr w:type="spellStart"/>
+      <w:r>
+        <w:rPr>
+          <w:rFonts w:eastAsia="Times New Roman" w:cs="Times New Roman"/>
+          <w:lang w:eastAsia="en-US"/>
+        </w:rPr>
+        <w:t>JsonSerializer</w:t>
+      </w:r>
+      <w:proofErr w:type="spellEnd"/>
+      <w:r>
+        <w:rPr>
+          <w:rFonts w:eastAsia="Times New Roman" w:cs="Times New Roman"/>
+          <w:lang w:eastAsia="en-US"/>
+        </w:rPr>
+        <w:t xml:space="preserve"> </w:t>
+      </w:r>
+    </w:p>
+    <w:p>
+      <w:pPr>
+        <w:numPr>
+          <w:ilvl w:val="1"/>
+          <w:numId w:val="2"/>
+        </w:numPr>
+        <w:spacing w:line="240" w:lineRule="auto"/>
+        <w:rPr>
+          <w:rFonts w:eastAsia="Times New Roman" w:cs="Times New Roman"/>
+          <w:lang w:eastAsia="en-US"/>
+        </w:rPr>
+      </w:pPr>
+      <w:proofErr w:type="spellStart"/>
+      <w:r>
+        <w:rPr>
+          <w:rFonts w:eastAsia="Times New Roman" w:cs="Times New Roman"/>
+          <w:lang w:eastAsia="en-US"/>
+        </w:rPr>
+        <w:t>CookieStore</w:t>
+      </w:r>
+      <w:proofErr w:type="spellEnd"/>
+      <w:r>
+        <w:rPr>
+          <w:rFonts w:eastAsia="Times New Roman" w:cs="Times New Roman"/>
+          <w:lang w:eastAsia="en-US"/>
+        </w:rPr>
+        <w:t xml:space="preserve"> </w:t>
+      </w:r>
+    </w:p>
+    <w:p>
+      <w:pPr>
+        <w:numPr>
+          <w:ilvl w:val="1"/>
+          <w:numId w:val="2"/>
+        </w:numPr>
+        <w:spacing w:line="240" w:lineRule="auto"/>
+        <w:rPr>
+          <w:rFonts w:eastAsia="Times New Roman" w:cs="Times New Roman"/>
+          <w:lang w:eastAsia="en-US"/>
+        </w:rPr>
+      </w:pPr>
+      <w:proofErr w:type="spellStart"/>
+      <w:proofErr w:type="gramStart"/>
+      <w:r>
+        <w:rPr>
+          <w:rFonts w:eastAsia="Times New Roman" w:cs="Times New Roman"/>
+          <w:lang w:eastAsia="en-US"/>
+        </w:rPr>
+        <w:t>TimeoutPolicy</w:t>
+      </w:r>
+      <w:proofErr w:type="spellEnd"/>
+      <w:proofErr w:type="gramEnd"/>
+      <w:r>
+        <w:rPr>
+          <w:rFonts w:eastAsia="Times New Roman" w:cs="Times New Roman"/>
+          <w:lang w:eastAsia="en-US"/>
+        </w:rPr>
+        <w:t xml:space="preserve"> </w:t>
+      </w:r>
+    </w:p>
+    <w:p>
+      <w:pPr>
+        <w:numPr>
+          <w:ilvl w:val="1"/>
+          <w:numId w:val="2"/>
+        </w:numPr>
+        <w:spacing w:line="240" w:lineRule="auto"/>
+        <w:rPr>
+          <w:rFonts w:eastAsia="Times New Roman" w:cs="Times New Roman"/>
+          <w:lang w:eastAsia="en-US"/>
+        </w:rPr>
+      </w:pPr>
+      <w:proofErr w:type="gramStart"/>
+      <w:r>
+        <w:rPr>
+          <w:rFonts w:eastAsia="Times New Roman" w:cs="Times New Roman"/>
+          <w:lang w:eastAsia="en-US"/>
+        </w:rPr>
+        <w:t>timeout(</w:t>
       </w:r>
       <w:proofErr w:type="gramEnd"/>
       <w:r>
@@ -913,6 +1135,147 @@
     </w:lvl>
   </w:abstractNum>
   <w:abstractNum w:abstractNumId="1" w15:restartNumberingAfterBreak="0">
+    <w:nsid w:val="31A67681"/>
+    <w:multiLevelType w:val="multilevel"/>
+    <w:tmpl w:val="D6A6514E"/>
+    <w:lvl w:ilvl="0">
+      <w:start w:val="3"/>
+      <w:numFmt w:val="decimal"/>
+      <w:lvlText w:val="%1."/>
+      <w:lvlJc w:val="left"/>
+      <w:pPr>
+        <w:tabs>
+          <w:tab w:val="num" w:pos="720"/>
+        </w:tabs>
+        <w:ind w:left="720" w:hanging="360"/>
+      </w:pPr>
+      <w:rPr>
+        <w:rFonts w:hint="default"/>
+      </w:rPr>
+    </w:lvl>
+    <w:lvl w:ilvl="1">
+      <w:start w:val="1"/>
+      <w:numFmt w:val="bullet"/>
+      <w:lvlText w:val="o"/>
+      <w:lvlJc w:val="left"/>
+      <w:pPr>
+        <w:tabs>
+          <w:tab w:val="num" w:pos="1440"/>
+        </w:tabs>
+        <w:ind w:left="1440" w:hanging="360"/>
+      </w:pPr>
+      <w:rPr>
+        <w:rFonts w:ascii="Courier New" w:hAnsi="Courier New" w:hint="default"/>
+        <w:sz w:val="20"/>
+      </w:rPr>
+    </w:lvl>
+    <w:lvl w:ilvl="2">
+      <w:start w:val="1"/>
+      <w:numFmt w:val="decimal"/>
+      <w:lvlText w:val="%3."/>
+      <w:lvlJc w:val="left"/>
+      <w:pPr>
+        <w:tabs>
+          <w:tab w:val="num" w:pos="2160"/>
+        </w:tabs>
+        <w:ind w:left="2160" w:hanging="360"/>
+      </w:pPr>
+      <w:rPr>
+        <w:rFonts w:hint="default"/>
+      </w:rPr>
+    </w:lvl>
+    <w:lvl w:ilvl="3">
+      <w:start w:val="1"/>
+      <w:numFmt w:val="decimal"/>
+      <w:lvlText w:val="%4."/>
+      <w:lvlJc w:val="left"/>
+      <w:pPr>
+        <w:tabs>
+          <w:tab w:val="num" w:pos="2880"/>
+        </w:tabs>
+        <w:ind w:left="2880" w:hanging="360"/>
+      </w:pPr>
+      <w:rPr>
+        <w:rFonts w:hint="default"/>
+      </w:rPr>
+    </w:lvl>
+    <w:lvl w:ilvl="4">
+      <w:start w:val="1"/>
+      <w:numFmt w:val="decimal"/>
+      <w:lvlText w:val="%5."/>
+      <w:lvlJc w:val="left"/>
+      <w:pPr>
+        <w:tabs>
+          <w:tab w:val="num" w:pos="3600"/>
+        </w:tabs>
+        <w:ind w:left="3600" w:hanging="360"/>
+      </w:pPr>
+      <w:rPr>
+        <w:rFonts w:hint="default"/>
+      </w:rPr>
+    </w:lvl>
+    <w:lvl w:ilvl="5">
+      <w:start w:val="1"/>
+      <w:numFmt w:val="decimal"/>
+      <w:lvlText w:val="%6."/>
+      <w:lvlJc w:val="left"/>
+      <w:pPr>
+        <w:tabs>
+          <w:tab w:val="num" w:pos="4320"/>
+        </w:tabs>
+        <w:ind w:left="4320" w:hanging="360"/>
+      </w:pPr>
+      <w:rPr>
+        <w:rFonts w:hint="default"/>
+      </w:rPr>
+    </w:lvl>
+    <w:lvl w:ilvl="6">
+      <w:start w:val="1"/>
+      <w:numFmt w:val="decimal"/>
+      <w:lvlText w:val="%7."/>
+      <w:lvlJc w:val="left"/>
+      <w:pPr>
+        <w:tabs>
+          <w:tab w:val="num" w:pos="5040"/>
+        </w:tabs>
+        <w:ind w:left="5040" w:hanging="360"/>
+      </w:pPr>
+      <w:rPr>
+        <w:rFonts w:hint="default"/>
+      </w:rPr>
+    </w:lvl>
+    <w:lvl w:ilvl="7">
+      <w:start w:val="1"/>
+      <w:numFmt w:val="decimal"/>
+      <w:lvlText w:val="%8."/>
+      <w:lvlJc w:val="left"/>
+      <w:pPr>
+        <w:tabs>
+          <w:tab w:val="num" w:pos="5760"/>
+        </w:tabs>
+        <w:ind w:left="5760" w:hanging="360"/>
+      </w:pPr>
+      <w:rPr>
+        <w:rFonts w:hint="default"/>
+      </w:rPr>
+    </w:lvl>
+    <w:lvl w:ilvl="8">
+      <w:start w:val="1"/>
+      <w:numFmt w:val="decimal"/>
+      <w:lvlText w:val="%9."/>
+      <w:lvlJc w:val="left"/>
+      <w:pPr>
+        <w:tabs>
+          <w:tab w:val="num" w:pos="6480"/>
+        </w:tabs>
+        <w:ind w:left="6480" w:hanging="360"/>
+      </w:pPr>
+      <w:rPr>
+        <w:rFonts w:hint="default"/>
+      </w:rPr>
+    </w:lvl>
+  </w:abstractNum>
+  <w:abstractNum w:abstractNumId="2" w15:restartNumberingAfterBreak="0">
     <w:nsid w:val="53733CB3"/>
     <w:multiLevelType w:val="hybridMultilevel"/>
     <w:tmpl w:val="2952A510"/>
@@ -1026,11 +1389,166 @@
       </w:rPr>
     </w:lvl>
   </w:abstractNum>
+  <w:abstractNum w:abstractNumId="3" w15:restartNumberingAfterBreak="0">
+    <w:nsid w:val="74BB08FF"/>
+    <w:multiLevelType w:val="multilevel"/>
+    <w:tmpl w:val="8A3A6C7C"/>
+    <w:lvl w:ilvl="0">
+      <w:start w:val="1"/>
+      <w:numFmt w:val="bullet"/>
+      <w:lvlText w:val=""/>
+      <w:lvlJc w:val="left"/>
+      <w:pPr>
+        <w:tabs>
+          <w:tab w:val="num" w:pos="1080"/>
+        </w:tabs>
+        <w:ind w:left="1080" w:hanging="360"/>
+      </w:pPr>
+      <w:rPr>
+        <w:rFonts w:ascii="Symbol" w:hAnsi="Symbol" w:hint="default"/>
+        <w:sz w:val="20"/>
+      </w:rPr>
+    </w:lvl>
+    <w:lvl w:ilvl="1" w:tentative="1">
+      <w:start w:val="1"/>
+      <w:numFmt w:val="bullet"/>
+      <w:lvlText w:val="o"/>
+      <w:lvlJc w:val="left"/>
+      <w:pPr>
+        <w:tabs>
+          <w:tab w:val="num" w:pos="1800"/>
+        </w:tabs>
+        <w:ind w:left="1800" w:hanging="360"/>
+      </w:pPr>
+      <w:rPr>
+        <w:rFonts w:ascii="Courier New" w:hAnsi="Courier New" w:hint="default"/>
+        <w:sz w:val="20"/>
+      </w:rPr>
+    </w:lvl>
+    <w:lvl w:ilvl="2" w:tentative="1">
+      <w:start w:val="1"/>
+      <w:numFmt w:val="bullet"/>
+      <w:lvlText w:val=""/>
+      <w:lvlJc w:val="left"/>
+      <w:pPr>
+        <w:tabs>
+          <w:tab w:val="num" w:pos="2520"/>
+        </w:tabs>
+        <w:ind w:left="2520" w:hanging="360"/>
+      </w:pPr>
+      <w:rPr>
+        <w:rFonts w:ascii="Wingdings" w:hAnsi="Wingdings" w:hint="default"/>
+        <w:sz w:val="20"/>
+      </w:rPr>
+    </w:lvl>
+    <w:lvl w:ilvl="3" w:tentative="1">
+      <w:start w:val="1"/>
+      <w:numFmt w:val="bullet"/>
+      <w:lvlText w:val=""/>
+      <w:lvlJc w:val="left"/>
+      <w:pPr>
+        <w:tabs>
+          <w:tab w:val="num" w:pos="3240"/>
+        </w:tabs>
+        <w:ind w:left="3240" w:hanging="360"/>
+      </w:pPr>
+      <w:rPr>
+        <w:rFonts w:ascii="Wingdings" w:hAnsi="Wingdings" w:hint="default"/>
+        <w:sz w:val="20"/>
+      </w:rPr>
+    </w:lvl>
+    <w:lvl w:ilvl="4" w:tentative="1">
+      <w:start w:val="1"/>
+      <w:numFmt w:val="bullet"/>
+      <w:lvlText w:val=""/>
+      <w:lvlJc w:val="left"/>
+      <w:pPr>
+        <w:tabs>
+          <w:tab w:val="num" w:pos="3960"/>
+        </w:tabs>
+        <w:ind w:left="3960" w:hanging="360"/>
+      </w:pPr>
+      <w:rPr>
+        <w:rFonts w:ascii="Wingdings" w:hAnsi="Wingdings" w:hint="default"/>
+        <w:sz w:val="20"/>
+      </w:rPr>
+    </w:lvl>
+    <w:lvl w:ilvl="5" w:tentative="1">
+      <w:start w:val="1"/>
+      <w:numFmt w:val="bullet"/>
+      <w:lvlText w:val=""/>
+      <w:lvlJc w:val="left"/>
+      <w:pPr>
+        <w:tabs>
+          <w:tab w:val="num" w:pos="4680"/>
+        </w:tabs>
+        <w:ind w:left="4680" w:hanging="360"/>
+      </w:pPr>
+      <w:rPr>
+        <w:rFonts w:ascii="Wingdings" w:hAnsi="Wingdings" w:hint="default"/>
+        <w:sz w:val="20"/>
+      </w:rPr>
+    </w:lvl>
+    <w:lvl w:ilvl="6" w:tentative="1">
+      <w:start w:val="1"/>
+      <w:numFmt w:val="bullet"/>
+      <w:lvlText w:val=""/>
+      <w:lvlJc w:val="left"/>
+      <w:pPr>
+        <w:tabs>
+          <w:tab w:val="num" w:pos="5400"/>
+        </w:tabs>
+        <w:ind w:left="5400" w:hanging="360"/>
+      </w:pPr>
+      <w:rPr>
+        <w:rFonts w:ascii="Wingdings" w:hAnsi="Wingdings" w:hint="default"/>
+        <w:sz w:val="20"/>
+      </w:rPr>
+    </w:lvl>
+    <w:lvl w:ilvl="7" w:tentative="1">
+      <w:start w:val="1"/>
+      <w:numFmt w:val="bullet"/>
+      <w:lvlText w:val=""/>
+      <w:lvlJc w:val="left"/>
+      <w:pPr>
+        <w:tabs>
+          <w:tab w:val="num" w:pos="6120"/>
+        </w:tabs>
+        <w:ind w:left="6120" w:hanging="360"/>
+      </w:pPr>
+      <w:rPr>
+        <w:rFonts w:ascii="Wingdings" w:hAnsi="Wingdings" w:hint="default"/>
+        <w:sz w:val="20"/>
+      </w:rPr>
+    </w:lvl>
+    <w:lvl w:ilvl="8" w:tentative="1">
+      <w:start w:val="1"/>
+      <w:numFmt w:val="bullet"/>
+      <w:lvlText w:val=""/>
+      <w:lvlJc w:val="left"/>
+      <w:pPr>
+        <w:tabs>
+          <w:tab w:val="num" w:pos="6840"/>
+        </w:tabs>
+        <w:ind w:left="6840" w:hanging="360"/>
+      </w:pPr>
+      <w:rPr>
+        <w:rFonts w:ascii="Wingdings" w:hAnsi="Wingdings" w:hint="default"/>
+        <w:sz w:val="20"/>
+      </w:rPr>
+    </w:lvl>
+  </w:abstractNum>
   <w:num w:numId="1" w16cid:durableId="1287154770">
-    <w:abstractNumId w:val="1"/>
+    <w:abstractNumId w:val="2"/>
   </w:num>
   <w:num w:numId="2" w16cid:durableId="173421705">
     <w:abstractNumId w:val="0"/>
+  </w:num>
+  <w:num w:numId="3" w16cid:durableId="226494263">
+    <w:abstractNumId w:val="1"/>
+  </w:num>
+  <w:num w:numId="4" w16cid:durableId="602110527">
+    <w:abstractNumId w:val="3"/>
   </w:num>
 </w:numbering>
 </file>

</xml_diff>